<commit_message>
fix: sửa lại tên 'Cáp Hửu Duy' (trước đổi nhầm thành 'Hữu')
</commit_message>
<xml_diff>
--- a/docs/De_cuong_du_an_FitDuel.docx
+++ b/docs/De_cuong_du_an_FitDuel.docx
@@ -836,7 +836,7 @@
                 <w:sz w:val="22"/>
                 <w:szCs w:val="22"/>
               </w:rPr>
-              <w:t xml:space="preserve">Cáp Hữu Duy</w:t>
+              <w:t xml:space="preserve">Cáp Hửu Duy</w:t>
             </w:r>
           </w:p>
         </w:tc>
@@ -4489,7 +4489,7 @@
       <w:r>
         <w:t xml:space="preserve">- </w:t>
       </w:r>
-      <w:hyperlink w:history="1" r:id="rId3obapg8ybpmh9cvlw9cvn">
+      <w:hyperlink w:history="1" r:id="rIdemqmzwkatzmtdc8ylqeab">
         <w:r>
           <w:rPr>
             <w:rStyle w:val="Hyperlink"/>
@@ -4505,7 +4505,7 @@
       <w:r>
         <w:t xml:space="preserve">- </w:t>
       </w:r>
-      <w:hyperlink w:history="1" r:id="rId6xzr5lrrgcizgjtokq8av">
+      <w:hyperlink w:history="1" r:id="rIddydonwjwpwvqtwqw3b2z3">
         <w:r>
           <w:rPr>
             <w:rStyle w:val="Hyperlink"/>
@@ -4521,7 +4521,7 @@
       <w:r>
         <w:t xml:space="preserve">- </w:t>
       </w:r>
-      <w:hyperlink w:history="1" r:id="rIdbeielwh4dnmmbsp6q3vmc">
+      <w:hyperlink w:history="1" r:id="rIdk83schzelnooo4hkyrvix">
         <w:r>
           <w:rPr>
             <w:rStyle w:val="Hyperlink"/>
@@ -4537,7 +4537,7 @@
       <w:r>
         <w:t xml:space="preserve">- </w:t>
       </w:r>
-      <w:hyperlink w:history="1" r:id="rIdzcj7ss8r5kbp8_kidslmk">
+      <w:hyperlink w:history="1" r:id="rIdfhi4ywpx2zysgyyre7jfx">
         <w:r>
           <w:rPr>
             <w:rStyle w:val="Hyperlink"/>
@@ -4553,7 +4553,7 @@
       <w:r>
         <w:t xml:space="preserve">- </w:t>
       </w:r>
-      <w:hyperlink w:history="1" r:id="rIdiiymmk6sclnkk6vipmyya">
+      <w:hyperlink w:history="1" r:id="rIdjvbf9zlt_rggjdsbfy5dh">
         <w:r>
           <w:rPr>
             <w:rStyle w:val="Hyperlink"/>
@@ -4569,7 +4569,7 @@
       <w:r>
         <w:t xml:space="preserve">- </w:t>
       </w:r>
-      <w:hyperlink w:history="1" r:id="rIdgvrkicjaxsja25v7epvbi">
+      <w:hyperlink w:history="1" r:id="rIdnt3ra7k4arc1bjx9y6rjz">
         <w:r>
           <w:rPr>
             <w:rStyle w:val="Hyperlink"/>

</xml_diff>